<commit_message>
feat: Implement multi-document batch upload with resilient loop, dynamic status containers, and summary dashboard
</commit_message>
<xml_diff>
--- a/data/Sample Contractor Invoice 1.docx
+++ b/data/Sample Contractor Invoice 1.docx
@@ -35,6 +35,7 @@
               <w15:appearance w15:val="hidden"/>
               <w:text/>
             </w:sdtPr>
+            <w:sdtEndPr/>
             <w:sdtContent>
               <w:p>
                 <w:pPr>
@@ -124,11 +125,11 @@
               <w:outlineLvl w:val="1"/>
             </w:pPr>
             <w:r>
-              <w:t>INVOICE #: INV-2026-001</w:t>
+              <w:t xml:space="preserve">INVOICE #: </w:t>
             </w:r>
             <w:r>
               <w:br/>
-              <w:t>DATE: 10-Jun-2026</w:t>
+              <w:t xml:space="preserve">DATE: </w:t>
             </w:r>
           </w:p>
         </w:tc>
@@ -167,9 +168,6 @@
             </w:sdt>
           </w:p>
           <w:p>
-            <w:r>
-              <w:t>Rahul Sharma</w:t>
-            </w:r>
             <w:r>
               <w:br/>
               <w:t xml:space="preserve">Alpha Retail </w:t>
@@ -231,9 +229,6 @@
             </w:sdt>
           </w:p>
           <w:p>
-            <w:r>
-              <w:t>Rahul Sharma</w:t>
-            </w:r>
             <w:r>
               <w:br/>
               <w:t xml:space="preserve">Alpha Retail </w:t>
@@ -269,6 +264,8 @@
             <w:r>
               <w:t xml:space="preserve"> Mumbai, MH 400705</w:t>
             </w:r>
+            <w:bookmarkStart w:id="0" w:name="_GoBack"/>
+            <w:bookmarkEnd w:id="0"/>
             <w:r>
               <w:br/>
               <w:t>Phone: +91 22 6789 1234</w:t>
@@ -625,19 +622,6 @@
             <w:pPr>
               <w:spacing w:line="264" w:lineRule="auto"/>
             </w:pPr>
-            <w:proofErr w:type="spellStart"/>
-            <w:r>
-              <w:t>Sudesh</w:t>
-            </w:r>
-            <w:proofErr w:type="spellEnd"/>
-            <w:r>
-              <w:t xml:space="preserve"> </w:t>
-            </w:r>
-            <w:proofErr w:type="spellStart"/>
-            <w:r>
-              <w:t>Mhamankar</w:t>
-            </w:r>
-            <w:proofErr w:type="spellEnd"/>
           </w:p>
         </w:tc>
         <w:tc>
@@ -649,9 +633,6 @@
               <w:spacing w:line="264" w:lineRule="auto"/>
               <w:cnfStyle w:val="000000000000" w:firstRow="0" w:lastRow="0" w:firstColumn="0" w:lastColumn="0" w:oddVBand="0" w:evenVBand="0" w:oddHBand="0" w:evenHBand="0" w:firstRowFirstColumn="0" w:firstRowLastColumn="0" w:lastRowFirstColumn="0" w:lastRowLastColumn="0"/>
             </w:pPr>
-            <w:r>
-              <w:t>PO-AR-2026-101</w:t>
-            </w:r>
           </w:p>
         </w:tc>
         <w:tc>
@@ -663,9 +644,6 @@
               <w:spacing w:line="264" w:lineRule="auto"/>
               <w:cnfStyle w:val="000000000000" w:firstRow="0" w:lastRow="0" w:firstColumn="0" w:lastColumn="0" w:oddVBand="0" w:evenVBand="0" w:oddHBand="0" w:evenHBand="0" w:firstRowFirstColumn="0" w:firstRowLastColumn="0" w:lastRowFirstColumn="0" w:lastRowLastColumn="0"/>
             </w:pPr>
-            <w:r>
-              <w:t>Rahul Sharma</w:t>
-            </w:r>
           </w:p>
         </w:tc>
         <w:tc>
@@ -1122,8 +1100,6 @@
             </w:pPr>
           </w:p>
         </w:tc>
-        <w:bookmarkStart w:id="0" w:name="_GoBack"/>
-        <w:bookmarkEnd w:id="0"/>
       </w:tr>
       <w:tr>
         <w:tc>
@@ -1506,7 +1482,7 @@
               <w:spacing w:line="264" w:lineRule="auto"/>
             </w:pPr>
             <w:r>
-              <w:t>₹84,960</w:t>
+              <w:t>₹</w:t>
             </w:r>
           </w:p>
         </w:tc>
@@ -1517,29 +1493,11 @@
         <w:pStyle w:val="Instructions"/>
       </w:pPr>
       <w:r>
-        <w:t>If you have any questions concerning this invoice, contact</w:t>
+        <w:t>If you have any questions concerning this invoice, contact:</w:t>
       </w:r>
-      <w:proofErr w:type="gramStart"/>
-      <w:r>
-        <w:t>:</w:t>
-      </w:r>
-      <w:proofErr w:type="gramEnd"/>
-      <w:r>
-        <w:br/>
-      </w:r>
-      <w:proofErr w:type="spellStart"/>
-      <w:r>
-        <w:t>Sudesh</w:t>
-      </w:r>
-      <w:proofErr w:type="spellEnd"/>
       <w:r>
         <w:t xml:space="preserve"> </w:t>
       </w:r>
-      <w:proofErr w:type="spellStart"/>
-      <w:r>
-        <w:t>Mhamankar</w:t>
-      </w:r>
-      <w:proofErr w:type="spellEnd"/>
       <w:r>
         <w:br/>
         <w:t>+91 22 4567 8901</w:t>
@@ -3632,10 +3590,7 @@
             <w:pStyle w:val="B7B54E4E45964142A844FCAC2E6CDE7E"/>
           </w:pPr>
           <w:r>
-            <w:t xml:space="preserve">Due </w:t>
-          </w:r>
-          <w:r>
-            <w:t>on receipt</w:t>
+            <w:t>Due on receipt</w:t>
           </w:r>
         </w:p>
       </w:docPartBody>
@@ -3970,6 +3925,7 @@
     <w:rsid w:val="00451AA0"/>
     <w:rsid w:val="006A456A"/>
     <w:rsid w:val="009A4AF8"/>
+    <w:rsid w:val="00AA4463"/>
   </w:rsids>
   <m:mathPr>
     <m:mathFont m:val="Cambria Math"/>
@@ -4865,26 +4821,6 @@
 </file>
 
 <file path=customXml/item1.xml><?xml version="1.0" encoding="utf-8"?>
-<p:properties xmlns:p="http://schemas.microsoft.com/office/2006/metadata/properties" xmlns:xsi="http://www.w3.org/2001/XMLSchema-instance" xmlns:pc="http://schemas.microsoft.com/office/infopath/2007/PartnerControls">
-  <documentManagement>
-    <lcf76f155ced4ddcb4097134ff3c332f xmlns="6d811abf-060d-4937-a289-8a38b78ca833">
-      <Terms xmlns="http://schemas.microsoft.com/office/infopath/2007/PartnerControls"/>
-    </lcf76f155ced4ddcb4097134ff3c332f>
-    <TaxCatchAll xmlns="6cd10cd5-43dc-4c20-a8b2-3d33777b0436" xsi:nil="true"/>
-  </documentManagement>
-</p:properties>
-</file>
-
-<file path=customXml/item2.xml><?xml version="1.0" encoding="utf-8"?>
-<?mso-contentType ?>
-<FormTemplates xmlns="http://schemas.microsoft.com/sharepoint/v3/contenttype/forms">
-  <Display>DocumentLibraryForm</Display>
-  <Edit>DocumentLibraryForm</Edit>
-  <New>DocumentLibraryForm</New>
-</FormTemplates>
-</file>
-
-<file path=customXml/item3.xml><?xml version="1.0" encoding="utf-8"?>
 <ct:contentTypeSchema xmlns:ct="http://schemas.microsoft.com/office/2006/metadata/contentType" xmlns:ma="http://schemas.microsoft.com/office/2006/metadata/properties/metaAttributes" ct:_="" ma:_="" ma:contentTypeName="Document" ma:contentTypeID="0x01010026E0FF61EF36C24DA7A02B935ED59AC9" ma:contentTypeVersion="12" ma:contentTypeDescription="Create a new document." ma:contentTypeScope="" ma:versionID="d8a0b021dcbe3bfb38c70fc2951d4c9e">
   <xsd:schema xmlns:xsd="http://www.w3.org/2001/XMLSchema" xmlns:xs="http://www.w3.org/2001/XMLSchema" xmlns:p="http://schemas.microsoft.com/office/2006/metadata/properties" xmlns:ns2="6d811abf-060d-4937-a289-8a38b78ca833" xmlns:ns3="6cd10cd5-43dc-4c20-a8b2-3d33777b0436" targetNamespace="http://schemas.microsoft.com/office/2006/metadata/properties" ma:root="true" ma:fieldsID="d7b459a9cf9a987402e2ff62620303d3" ns2:_="" ns3:_="">
     <xsd:import namespace="6d811abf-060d-4937-a289-8a38b78ca833"/>
@@ -5085,26 +5021,27 @@
 </ct:contentTypeSchema>
 </file>
 
-<file path=customXml/itemProps1.xml><?xml version="1.0" encoding="utf-8"?>
-<ds:datastoreItem xmlns:ds="http://schemas.openxmlformats.org/officeDocument/2006/customXml" ds:itemID="{B5033746-979A-41B6-B5DF-EA2BB9DEFD57}">
-  <ds:schemaRefs>
-    <ds:schemaRef ds:uri="http://schemas.microsoft.com/office/2006/metadata/properties"/>
-    <ds:schemaRef ds:uri="http://schemas.microsoft.com/office/infopath/2007/PartnerControls"/>
-    <ds:schemaRef ds:uri="6d811abf-060d-4937-a289-8a38b78ca833"/>
-    <ds:schemaRef ds:uri="6cd10cd5-43dc-4c20-a8b2-3d33777b0436"/>
-  </ds:schemaRefs>
-</ds:datastoreItem>
+<file path=customXml/item2.xml><?xml version="1.0" encoding="utf-8"?>
+<?mso-contentType ?>
+<FormTemplates xmlns="http://schemas.microsoft.com/sharepoint/v3/contenttype/forms">
+  <Display>DocumentLibraryForm</Display>
+  <Edit>DocumentLibraryForm</Edit>
+  <New>DocumentLibraryForm</New>
+</FormTemplates>
 </file>
 
-<file path=customXml/itemProps2.xml><?xml version="1.0" encoding="utf-8"?>
-<ds:datastoreItem xmlns:ds="http://schemas.openxmlformats.org/officeDocument/2006/customXml" ds:itemID="{477F216C-A227-4227-87C9-7DD324C44FAA}">
-  <ds:schemaRefs>
-    <ds:schemaRef ds:uri="http://schemas.microsoft.com/sharepoint/v3/contenttype/forms"/>
-  </ds:schemaRefs>
-</ds:datastoreItem>
+<file path=customXml/item3.xml><?xml version="1.0" encoding="utf-8"?>
+<p:properties xmlns:p="http://schemas.microsoft.com/office/2006/metadata/properties" xmlns:xsi="http://www.w3.org/2001/XMLSchema-instance" xmlns:pc="http://schemas.microsoft.com/office/infopath/2007/PartnerControls">
+  <documentManagement>
+    <lcf76f155ced4ddcb4097134ff3c332f xmlns="6d811abf-060d-4937-a289-8a38b78ca833">
+      <Terms xmlns="http://schemas.microsoft.com/office/infopath/2007/PartnerControls"/>
+    </lcf76f155ced4ddcb4097134ff3c332f>
+    <TaxCatchAll xmlns="6cd10cd5-43dc-4c20-a8b2-3d33777b0436" xsi:nil="true"/>
+  </documentManagement>
+</p:properties>
 </file>
 
-<file path=customXml/itemProps3.xml><?xml version="1.0" encoding="utf-8"?>
+<file path=customXml/itemProps1.xml><?xml version="1.0" encoding="utf-8"?>
 <ds:datastoreItem xmlns:ds="http://schemas.openxmlformats.org/officeDocument/2006/customXml" ds:itemID="{255E38E0-F0AA-41BA-AC64-82385807A71B}">
   <ds:schemaRefs>
     <ds:schemaRef ds:uri="http://schemas.microsoft.com/office/2006/metadata/contentType"/>
@@ -5121,4 +5058,23 @@
     <ds:schemaRef ds:uri="http://schemas.microsoft.com/internal/obd"/>
   </ds:schemaRefs>
 </ds:datastoreItem>
+</file>
+
+<file path=customXml/itemProps2.xml><?xml version="1.0" encoding="utf-8"?>
+<ds:datastoreItem xmlns:ds="http://schemas.openxmlformats.org/officeDocument/2006/customXml" ds:itemID="{477F216C-A227-4227-87C9-7DD324C44FAA}">
+  <ds:schemaRefs>
+    <ds:schemaRef ds:uri="http://schemas.microsoft.com/sharepoint/v3/contenttype/forms"/>
+  </ds:schemaRefs>
+</ds:datastoreItem>
+</file>
+
+<file path=customXml/itemProps3.xml><?xml version="1.0" encoding="utf-8"?>
+<ds:datastoreItem xmlns:ds="http://schemas.openxmlformats.org/officeDocument/2006/customXml" ds:itemID="{B5033746-979A-41B6-B5DF-EA2BB9DEFD57}">
+  <ds:schemaRefs>
+    <ds:schemaRef ds:uri="http://schemas.microsoft.com/office/2006/metadata/properties"/>
+    <ds:schemaRef ds:uri="http://schemas.microsoft.com/office/infopath/2007/PartnerControls"/>
+    <ds:schemaRef ds:uri="6d811abf-060d-4937-a289-8a38b78ca833"/>
+    <ds:schemaRef ds:uri="6cd10cd5-43dc-4c20-a8b2-3d33777b0436"/>
+  </ds:schemaRefs>
+</ds:datastoreItem>
 </file>
</xml_diff>